<commit_message>
atualização da lição dia 01/09/2026 terça-feira
</commit_message>
<xml_diff>
--- a/Apostila/apostila.docx
+++ b/Apostila/apostila.docx
@@ -1134,6 +1134,7 @@
       </w:pPr>
       <w:r>
         <w:rPr>
+          <w:noProof/>
           <w:sz w:val="24"/>
           <w:szCs w:val="24"/>
         </w:rPr>
@@ -1204,6 +1205,7 @@
       </w:r>
       <w:r>
         <w:rPr>
+          <w:noProof/>
           <w:sz w:val="24"/>
           <w:szCs w:val="24"/>
         </w:rPr>
@@ -1394,6 +1396,9 @@
         <w:br/>
       </w:r>
       <w:r>
+        <w:rPr>
+          <w:noProof/>
+        </w:rPr>
         <w:drawing>
           <wp:inline distT="0" distB="0" distL="0" distR="0" wp14:anchorId="00254EDA" wp14:editId="72359B11">
             <wp:extent cx="3229426" cy="1009791"/>
@@ -1488,6 +1493,9 @@
         <w:br/>
       </w:r>
       <w:r>
+        <w:rPr>
+          <w:noProof/>
+        </w:rPr>
         <w:drawing>
           <wp:inline distT="0" distB="0" distL="0" distR="0" wp14:anchorId="187F9F8F" wp14:editId="7318E6D2">
             <wp:extent cx="2353003" cy="581106"/>
@@ -1528,6 +1536,9 @@
         <w:br/>
       </w:r>
       <w:r>
+        <w:rPr>
+          <w:noProof/>
+        </w:rPr>
         <w:drawing>
           <wp:inline distT="0" distB="0" distL="0" distR="0" wp14:anchorId="6109051E" wp14:editId="32164589">
             <wp:extent cx="2362530" cy="809738"/>
@@ -1618,6 +1629,9 @@
         <w:br/>
       </w:r>
       <w:r>
+        <w:rPr>
+          <w:noProof/>
+        </w:rPr>
         <w:drawing>
           <wp:anchor distT="0" distB="0" distL="114300" distR="114300" simplePos="0" relativeHeight="251667456" behindDoc="0" locked="0" layoutInCell="1" allowOverlap="1" wp14:anchorId="54EEFEFB">
             <wp:simplePos x="0" y="0"/>
@@ -1767,6 +1781,9 @@
         <w:br/>
       </w:r>
       <w:r>
+        <w:rPr>
+          <w:noProof/>
+        </w:rPr>
         <w:drawing>
           <wp:inline distT="0" distB="0" distL="0" distR="0" wp14:anchorId="77C54E66" wp14:editId="1228776F">
             <wp:extent cx="5400040" cy="1504950"/>
@@ -1803,12 +1820,13 @@
           </wp:inline>
         </w:drawing>
       </w:r>
-      <w:bookmarkStart w:id="0" w:name="_GoBack"/>
-      <w:bookmarkEnd w:id="0"/>
       <w:r>
         <w:br/>
       </w:r>
       <w:r>
+        <w:rPr>
+          <w:noProof/>
+        </w:rPr>
         <w:drawing>
           <wp:inline distT="0" distB="0" distL="0" distR="0" wp14:anchorId="21D7FB75" wp14:editId="20C6BB86">
             <wp:extent cx="2667372" cy="866896"/>
@@ -1860,12 +1878,539 @@
         <w:pStyle w:val="PargrafodaLista"/>
         <w:numPr>
           <w:ilvl w:val="0"/>
-          <w:numId w:val="1"/>
+          <w:numId w:val="3"/>
         </w:numPr>
         <w:tabs>
           <w:tab w:val="left" w:pos="915"/>
         </w:tabs>
       </w:pPr>
+      <w:r>
+        <w:t xml:space="preserve">No &lt;header&gt;&lt;/header&gt;, inserimos a </w:t>
+      </w:r>
+      <w:proofErr w:type="spellStart"/>
+      <w:r>
+        <w:t>tag</w:t>
+      </w:r>
+      <w:proofErr w:type="spellEnd"/>
+      <w:r>
+        <w:t xml:space="preserve"> &lt;h1&gt;&lt;/h1&gt; com a imagem da logo. E, logo abaixo, fizemos uma lista não-ordenada com os itens que posteriormente será o menu da página, onde colocamos a </w:t>
+      </w:r>
+      <w:proofErr w:type="spellStart"/>
+      <w:r>
+        <w:t>tag</w:t>
+      </w:r>
+      <w:proofErr w:type="spellEnd"/>
+      <w:r>
+        <w:t xml:space="preserve"> &lt;a </w:t>
+      </w:r>
+      <w:proofErr w:type="spellStart"/>
+      <w:r>
+        <w:t>href</w:t>
+      </w:r>
+      <w:proofErr w:type="spellEnd"/>
+      <w:r>
+        <w:t xml:space="preserve"> “”&gt;&lt;/a&gt; ancora para link com as páginas do projeto conforma imagem:</w:t>
+      </w:r>
+    </w:p>
+    <w:p>
+      <w:pPr>
+        <w:pStyle w:val="PargrafodaLista"/>
+        <w:tabs>
+          <w:tab w:val="left" w:pos="915"/>
+        </w:tabs>
+        <w:ind w:left="927"/>
+      </w:pPr>
+      <w:r>
+        <w:drawing>
+          <wp:inline distT="0" distB="0" distL="0" distR="0" wp14:anchorId="31E82AB0" wp14:editId="148890BE">
+            <wp:extent cx="4363059" cy="1590897"/>
+            <wp:effectExtent l="0" t="0" r="0" b="9525"/>
+            <wp:docPr id="15" name="Imagem 15"/>
+            <wp:cNvGraphicFramePr>
+              <a:graphicFrameLocks xmlns:a="http://schemas.openxmlformats.org/drawingml/2006/main" noChangeAspect="1"/>
+            </wp:cNvGraphicFramePr>
+            <a:graphic xmlns:a="http://schemas.openxmlformats.org/drawingml/2006/main">
+              <a:graphicData uri="http://schemas.openxmlformats.org/drawingml/2006/picture">
+                <pic:pic xmlns:pic="http://schemas.openxmlformats.org/drawingml/2006/picture">
+                  <pic:nvPicPr>
+                    <pic:cNvPr id="1" name=""/>
+                    <pic:cNvPicPr/>
+                  </pic:nvPicPr>
+                  <pic:blipFill>
+                    <a:blip r:embed="rId20"/>
+                    <a:stretch>
+                      <a:fillRect/>
+                    </a:stretch>
+                  </pic:blipFill>
+                  <pic:spPr>
+                    <a:xfrm>
+                      <a:off x="0" y="0"/>
+                      <a:ext cx="4363059" cy="1590897"/>
+                    </a:xfrm>
+                    <a:prstGeom prst="rect">
+                      <a:avLst/>
+                    </a:prstGeom>
+                  </pic:spPr>
+                </pic:pic>
+              </a:graphicData>
+            </a:graphic>
+          </wp:inline>
+        </w:drawing>
+      </w:r>
+    </w:p>
+    <w:p>
+      <w:pPr>
+        <w:pStyle w:val="PargrafodaLista"/>
+        <w:tabs>
+          <w:tab w:val="left" w:pos="915"/>
+        </w:tabs>
+        <w:ind w:left="927"/>
+      </w:pPr>
+    </w:p>
+    <w:p>
+      <w:pPr>
+        <w:pStyle w:val="PargrafodaLista"/>
+        <w:numPr>
+          <w:ilvl w:val="0"/>
+          <w:numId w:val="3"/>
+        </w:numPr>
+        <w:tabs>
+          <w:tab w:val="left" w:pos="915"/>
+        </w:tabs>
+      </w:pPr>
+      <w:r>
+        <w:lastRenderedPageBreak/>
+        <w:t>No</w:t>
+      </w:r>
+      <w:r>
+        <w:t xml:space="preserve"> produtos.css, na parte do </w:t>
+      </w:r>
+      <w:proofErr w:type="gramStart"/>
+      <w:r>
+        <w:t>header{</w:t>
+      </w:r>
+      <w:proofErr w:type="gramEnd"/>
+      <w:r>
+        <w:t>}, colocamos uma cor de fundo #</w:t>
+      </w:r>
+      <w:proofErr w:type="spellStart"/>
+      <w:r>
+        <w:t>cccccc</w:t>
+      </w:r>
+      <w:proofErr w:type="spellEnd"/>
+      <w:r>
+        <w:t>, como está na imagem abaixo:</w:t>
+      </w:r>
+      <w:r>
+        <w:br/>
+      </w:r>
+      <w:r>
+        <w:drawing>
+          <wp:inline distT="0" distB="0" distL="0" distR="0" wp14:anchorId="4FB71980" wp14:editId="0E62C45D">
+            <wp:extent cx="3010320" cy="771633"/>
+            <wp:effectExtent l="0" t="0" r="0" b="9525"/>
+            <wp:docPr id="19" name="Imagem 19"/>
+            <wp:cNvGraphicFramePr>
+              <a:graphicFrameLocks xmlns:a="http://schemas.openxmlformats.org/drawingml/2006/main" noChangeAspect="1"/>
+            </wp:cNvGraphicFramePr>
+            <a:graphic xmlns:a="http://schemas.openxmlformats.org/drawingml/2006/main">
+              <a:graphicData uri="http://schemas.openxmlformats.org/drawingml/2006/picture">
+                <pic:pic xmlns:pic="http://schemas.openxmlformats.org/drawingml/2006/picture">
+                  <pic:nvPicPr>
+                    <pic:cNvPr id="1" name=""/>
+                    <pic:cNvPicPr/>
+                  </pic:nvPicPr>
+                  <pic:blipFill>
+                    <a:blip r:embed="rId21"/>
+                    <a:stretch>
+                      <a:fillRect/>
+                    </a:stretch>
+                  </pic:blipFill>
+                  <pic:spPr>
+                    <a:xfrm>
+                      <a:off x="0" y="0"/>
+                      <a:ext cx="3010320" cy="771633"/>
+                    </a:xfrm>
+                    <a:prstGeom prst="rect">
+                      <a:avLst/>
+                    </a:prstGeom>
+                  </pic:spPr>
+                </pic:pic>
+              </a:graphicData>
+            </a:graphic>
+          </wp:inline>
+        </w:drawing>
+      </w:r>
+      <w:r>
+        <w:br/>
+      </w:r>
+    </w:p>
+    <w:p>
+      <w:pPr>
+        <w:pStyle w:val="PargrafodaLista"/>
+        <w:numPr>
+          <w:ilvl w:val="0"/>
+          <w:numId w:val="3"/>
+        </w:numPr>
+        <w:tabs>
+          <w:tab w:val="left" w:pos="915"/>
+        </w:tabs>
+      </w:pPr>
+      <w:r>
+        <w:t xml:space="preserve">Adicionamos a </w:t>
+      </w:r>
+      <w:proofErr w:type="spellStart"/>
+      <w:r>
+        <w:t>tag</w:t>
+      </w:r>
+      <w:proofErr w:type="spellEnd"/>
+      <w:r>
+        <w:t xml:space="preserve"> &lt;</w:t>
+      </w:r>
+      <w:proofErr w:type="spellStart"/>
+      <w:r>
+        <w:t>nav</w:t>
+      </w:r>
+      <w:proofErr w:type="spellEnd"/>
+      <w:r>
+        <w:t>&gt;&lt;/</w:t>
+      </w:r>
+      <w:proofErr w:type="spellStart"/>
+      <w:r>
+        <w:t>nav</w:t>
+      </w:r>
+      <w:proofErr w:type="spellEnd"/>
+      <w:r>
+        <w:t>&gt; à nossa lista, indicando que é um menu de navegação, conforme a imagem abaixo:</w:t>
+      </w:r>
+      <w:r>
+        <w:br/>
+      </w:r>
+      <w:r>
+        <w:drawing>
+          <wp:inline distT="0" distB="0" distL="0" distR="0" wp14:anchorId="5C3D1E87" wp14:editId="012FC8A6">
+            <wp:extent cx="2562583" cy="1324160"/>
+            <wp:effectExtent l="0" t="0" r="9525" b="9525"/>
+            <wp:docPr id="20" name="Imagem 20"/>
+            <wp:cNvGraphicFramePr>
+              <a:graphicFrameLocks xmlns:a="http://schemas.openxmlformats.org/drawingml/2006/main" noChangeAspect="1"/>
+            </wp:cNvGraphicFramePr>
+            <a:graphic xmlns:a="http://schemas.openxmlformats.org/drawingml/2006/main">
+              <a:graphicData uri="http://schemas.openxmlformats.org/drawingml/2006/picture">
+                <pic:pic xmlns:pic="http://schemas.openxmlformats.org/drawingml/2006/picture">
+                  <pic:nvPicPr>
+                    <pic:cNvPr id="1" name=""/>
+                    <pic:cNvPicPr/>
+                  </pic:nvPicPr>
+                  <pic:blipFill>
+                    <a:blip r:embed="rId22"/>
+                    <a:stretch>
+                      <a:fillRect/>
+                    </a:stretch>
+                  </pic:blipFill>
+                  <pic:spPr>
+                    <a:xfrm>
+                      <a:off x="0" y="0"/>
+                      <a:ext cx="2562583" cy="1324160"/>
+                    </a:xfrm>
+                    <a:prstGeom prst="rect">
+                      <a:avLst/>
+                    </a:prstGeom>
+                  </pic:spPr>
+                </pic:pic>
+              </a:graphicData>
+            </a:graphic>
+          </wp:inline>
+        </w:drawing>
+      </w:r>
+      <w:r>
+        <w:br/>
+      </w:r>
+    </w:p>
+    <w:p>
+      <w:pPr>
+        <w:pStyle w:val="PargrafodaLista"/>
+        <w:numPr>
+          <w:ilvl w:val="0"/>
+          <w:numId w:val="3"/>
+        </w:numPr>
+        <w:tabs>
+          <w:tab w:val="left" w:pos="915"/>
+        </w:tabs>
+      </w:pPr>
+      <w:r>
+        <w:t xml:space="preserve">No </w:t>
+      </w:r>
+      <w:proofErr w:type="spellStart"/>
+      <w:r>
+        <w:t>Css</w:t>
+      </w:r>
+      <w:proofErr w:type="spellEnd"/>
+      <w:r>
+        <w:t xml:space="preserve">, utilizamos a </w:t>
+      </w:r>
+      <w:proofErr w:type="spellStart"/>
+      <w:r>
+        <w:t>nav</w:t>
+      </w:r>
+      <w:proofErr w:type="spellEnd"/>
+      <w:r>
+        <w:t xml:space="preserve"> li para colocar os itens um ao lado do outro. E colocamos um espaço entre os itens. </w:t>
+      </w:r>
+      <w:r>
+        <w:br/>
+      </w:r>
+      <w:r>
+        <w:drawing>
+          <wp:inline distT="0" distB="0" distL="0" distR="0" wp14:anchorId="66DB025B" wp14:editId="56CF573F">
+            <wp:extent cx="2276793" cy="800212"/>
+            <wp:effectExtent l="0" t="0" r="0" b="0"/>
+            <wp:docPr id="21" name="Imagem 21"/>
+            <wp:cNvGraphicFramePr>
+              <a:graphicFrameLocks xmlns:a="http://schemas.openxmlformats.org/drawingml/2006/main" noChangeAspect="1"/>
+            </wp:cNvGraphicFramePr>
+            <a:graphic xmlns:a="http://schemas.openxmlformats.org/drawingml/2006/main">
+              <a:graphicData uri="http://schemas.openxmlformats.org/drawingml/2006/picture">
+                <pic:pic xmlns:pic="http://schemas.openxmlformats.org/drawingml/2006/picture">
+                  <pic:nvPicPr>
+                    <pic:cNvPr id="1" name=""/>
+                    <pic:cNvPicPr/>
+                  </pic:nvPicPr>
+                  <pic:blipFill>
+                    <a:blip r:embed="rId23"/>
+                    <a:stretch>
+                      <a:fillRect/>
+                    </a:stretch>
+                  </pic:blipFill>
+                  <pic:spPr>
+                    <a:xfrm>
+                      <a:off x="0" y="0"/>
+                      <a:ext cx="2276793" cy="800212"/>
+                    </a:xfrm>
+                    <a:prstGeom prst="rect">
+                      <a:avLst/>
+                    </a:prstGeom>
+                  </pic:spPr>
+                </pic:pic>
+              </a:graphicData>
+            </a:graphic>
+          </wp:inline>
+        </w:drawing>
+      </w:r>
+      <w:r>
+        <w:br/>
+      </w:r>
+    </w:p>
+    <w:p>
+      <w:pPr>
+        <w:pStyle w:val="PargrafodaLista"/>
+        <w:numPr>
+          <w:ilvl w:val="0"/>
+          <w:numId w:val="3"/>
+        </w:numPr>
+        <w:tabs>
+          <w:tab w:val="left" w:pos="915"/>
+        </w:tabs>
+      </w:pPr>
+      <w:r>
+        <w:t xml:space="preserve">Ainda no </w:t>
+      </w:r>
+      <w:proofErr w:type="spellStart"/>
+      <w:r>
+        <w:t>Css</w:t>
+      </w:r>
+      <w:proofErr w:type="spellEnd"/>
+      <w:r>
+        <w:t>, utilizando a &lt;</w:t>
+      </w:r>
+      <w:proofErr w:type="spellStart"/>
+      <w:r>
+        <w:t>nav</w:t>
+      </w:r>
+      <w:proofErr w:type="spellEnd"/>
+      <w:r>
+        <w:t xml:space="preserve"> a </w:t>
+      </w:r>
+      <w:proofErr w:type="spellStart"/>
+      <w:r>
+        <w:t>href</w:t>
+      </w:r>
+      <w:proofErr w:type="spellEnd"/>
+      <w:proofErr w:type="gramStart"/>
+      <w:r>
+        <w:t>””&lt;</w:t>
+      </w:r>
+      <w:proofErr w:type="gramEnd"/>
+      <w:r>
+        <w:t>/a&gt;&lt;</w:t>
+      </w:r>
+      <w:proofErr w:type="spellStart"/>
+      <w:r>
+        <w:t>nav</w:t>
+      </w:r>
+      <w:proofErr w:type="spellEnd"/>
+      <w:r>
+        <w:t xml:space="preserve">&gt;, estilizamos os textos da seguinte forma: </w:t>
+      </w:r>
+    </w:p>
+    <w:p>
+      <w:pPr>
+        <w:pStyle w:val="PargrafodaLista"/>
+        <w:numPr>
+          <w:ilvl w:val="0"/>
+          <w:numId w:val="4"/>
+        </w:numPr>
+        <w:tabs>
+          <w:tab w:val="left" w:pos="915"/>
+        </w:tabs>
+      </w:pPr>
+      <w:r>
+        <w:drawing>
+          <wp:anchor distT="0" distB="0" distL="114300" distR="114300" simplePos="0" relativeHeight="251668480" behindDoc="0" locked="0" layoutInCell="1" allowOverlap="1" wp14:anchorId="4B54C572">
+            <wp:simplePos x="0" y="0"/>
+            <wp:positionH relativeFrom="margin">
+              <wp:align>right</wp:align>
+            </wp:positionH>
+            <wp:positionV relativeFrom="paragraph">
+              <wp:posOffset>6985</wp:posOffset>
+            </wp:positionV>
+            <wp:extent cx="2448267" cy="1295581"/>
+            <wp:effectExtent l="0" t="0" r="9525" b="0"/>
+            <wp:wrapThrough wrapText="bothSides">
+              <wp:wrapPolygon edited="0">
+                <wp:start x="0" y="0"/>
+                <wp:lineTo x="0" y="21282"/>
+                <wp:lineTo x="21516" y="21282"/>
+                <wp:lineTo x="21516" y="0"/>
+                <wp:lineTo x="0" y="0"/>
+              </wp:wrapPolygon>
+            </wp:wrapThrough>
+            <wp:docPr id="25" name="Imagem 25"/>
+            <wp:cNvGraphicFramePr>
+              <a:graphicFrameLocks xmlns:a="http://schemas.openxmlformats.org/drawingml/2006/main" noChangeAspect="1"/>
+            </wp:cNvGraphicFramePr>
+            <a:graphic xmlns:a="http://schemas.openxmlformats.org/drawingml/2006/main">
+              <a:graphicData uri="http://schemas.openxmlformats.org/drawingml/2006/picture">
+                <pic:pic xmlns:pic="http://schemas.openxmlformats.org/drawingml/2006/picture">
+                  <pic:nvPicPr>
+                    <pic:cNvPr id="1" name=""/>
+                    <pic:cNvPicPr/>
+                  </pic:nvPicPr>
+                  <pic:blipFill>
+                    <a:blip r:embed="rId24">
+                      <a:extLst>
+                        <a:ext uri="{28A0092B-C50C-407E-A947-70E740481C1C}">
+                          <a14:useLocalDpi xmlns:a14="http://schemas.microsoft.com/office/drawing/2010/main" val="0"/>
+                        </a:ext>
+                      </a:extLst>
+                    </a:blip>
+                    <a:stretch>
+                      <a:fillRect/>
+                    </a:stretch>
+                  </pic:blipFill>
+                  <pic:spPr>
+                    <a:xfrm>
+                      <a:off x="0" y="0"/>
+                      <a:ext cx="2448267" cy="1295581"/>
+                    </a:xfrm>
+                    <a:prstGeom prst="rect">
+                      <a:avLst/>
+                    </a:prstGeom>
+                  </pic:spPr>
+                </pic:pic>
+              </a:graphicData>
+            </a:graphic>
+          </wp:anchor>
+        </w:drawing>
+      </w:r>
+      <w:r>
+        <w:t>Aumentamos o tamanho da fonte;</w:t>
+      </w:r>
+    </w:p>
+    <w:p>
+      <w:pPr>
+        <w:pStyle w:val="PargrafodaLista"/>
+        <w:numPr>
+          <w:ilvl w:val="0"/>
+          <w:numId w:val="4"/>
+        </w:numPr>
+        <w:tabs>
+          <w:tab w:val="left" w:pos="915"/>
+        </w:tabs>
+      </w:pPr>
+      <w:r>
+        <w:t>Deixamos a fonte em negrito e encorpamos o texto;</w:t>
+      </w:r>
+    </w:p>
+    <w:p>
+      <w:pPr>
+        <w:pStyle w:val="PargrafodaLista"/>
+        <w:numPr>
+          <w:ilvl w:val="0"/>
+          <w:numId w:val="4"/>
+        </w:numPr>
+        <w:tabs>
+          <w:tab w:val="left" w:pos="915"/>
+        </w:tabs>
+      </w:pPr>
+      <w:r>
+        <w:t>Transformamos o texto em maiúsculo;</w:t>
+      </w:r>
+    </w:p>
+    <w:p>
+      <w:pPr>
+        <w:pStyle w:val="PargrafodaLista"/>
+        <w:numPr>
+          <w:ilvl w:val="0"/>
+          <w:numId w:val="4"/>
+        </w:numPr>
+        <w:tabs>
+          <w:tab w:val="left" w:pos="915"/>
+        </w:tabs>
+      </w:pPr>
+      <w:r>
+        <w:t>Colocamos a cor preto no texto;</w:t>
+      </w:r>
+    </w:p>
+    <w:p>
+      <w:pPr>
+        <w:pStyle w:val="PargrafodaLista"/>
+        <w:numPr>
+          <w:ilvl w:val="0"/>
+          <w:numId w:val="4"/>
+        </w:numPr>
+        <w:tabs>
+          <w:tab w:val="left" w:pos="915"/>
+        </w:tabs>
+      </w:pPr>
+      <w:r>
+        <w:t>Tiramos o sublinhado.</w:t>
+      </w:r>
+    </w:p>
+    <w:p>
+      <w:pPr>
+        <w:tabs>
+          <w:tab w:val="left" w:pos="915"/>
+        </w:tabs>
+        <w:ind w:left="567"/>
+      </w:pPr>
+      <w:r>
+        <w:br/>
+      </w:r>
+    </w:p>
+    <w:p>
+      <w:pPr>
+        <w:pStyle w:val="PargrafodaLista"/>
+        <w:numPr>
+          <w:ilvl w:val="0"/>
+          <w:numId w:val="3"/>
+        </w:numPr>
+        <w:tabs>
+          <w:tab w:val="left" w:pos="915"/>
+        </w:tabs>
+      </w:pPr>
+      <w:bookmarkStart w:id="0" w:name="_GoBack"/>
+      <w:bookmarkEnd w:id="0"/>
     </w:p>
     <w:sectPr>
       <w:pgSz w:w="11906" w:h="16838"/>
@@ -1966,6 +2511,208 @@
     </w:lvl>
   </w:abstractNum>
   <w:abstractNum w:abstractNumId="1" w15:restartNumberingAfterBreak="0">
+    <w:nsid w:val="481B7478"/>
+    <w:multiLevelType w:val="hybridMultilevel"/>
+    <w:tmpl w:val="05060032"/>
+    <w:lvl w:ilvl="0" w:tplc="04160001">
+      <w:start w:val="1"/>
+      <w:numFmt w:val="bullet"/>
+      <w:lvlText w:val=""/>
+      <w:lvlJc w:val="left"/>
+      <w:pPr>
+        <w:ind w:left="720" w:hanging="360"/>
+      </w:pPr>
+      <w:rPr>
+        <w:rFonts w:ascii="Symbol" w:hAnsi="Symbol" w:hint="default"/>
+      </w:rPr>
+    </w:lvl>
+    <w:lvl w:ilvl="1" w:tplc="04160003" w:tentative="1">
+      <w:start w:val="1"/>
+      <w:numFmt w:val="bullet"/>
+      <w:lvlText w:val="o"/>
+      <w:lvlJc w:val="left"/>
+      <w:pPr>
+        <w:ind w:left="1440" w:hanging="360"/>
+      </w:pPr>
+      <w:rPr>
+        <w:rFonts w:ascii="Courier New" w:hAnsi="Courier New" w:cs="Courier New" w:hint="default"/>
+      </w:rPr>
+    </w:lvl>
+    <w:lvl w:ilvl="2" w:tplc="04160005" w:tentative="1">
+      <w:start w:val="1"/>
+      <w:numFmt w:val="bullet"/>
+      <w:lvlText w:val=""/>
+      <w:lvlJc w:val="left"/>
+      <w:pPr>
+        <w:ind w:left="2160" w:hanging="360"/>
+      </w:pPr>
+      <w:rPr>
+        <w:rFonts w:ascii="Wingdings" w:hAnsi="Wingdings" w:hint="default"/>
+      </w:rPr>
+    </w:lvl>
+    <w:lvl w:ilvl="3" w:tplc="04160001" w:tentative="1">
+      <w:start w:val="1"/>
+      <w:numFmt w:val="bullet"/>
+      <w:lvlText w:val=""/>
+      <w:lvlJc w:val="left"/>
+      <w:pPr>
+        <w:ind w:left="2880" w:hanging="360"/>
+      </w:pPr>
+      <w:rPr>
+        <w:rFonts w:ascii="Symbol" w:hAnsi="Symbol" w:hint="default"/>
+      </w:rPr>
+    </w:lvl>
+    <w:lvl w:ilvl="4" w:tplc="04160003" w:tentative="1">
+      <w:start w:val="1"/>
+      <w:numFmt w:val="bullet"/>
+      <w:lvlText w:val="o"/>
+      <w:lvlJc w:val="left"/>
+      <w:pPr>
+        <w:ind w:left="3600" w:hanging="360"/>
+      </w:pPr>
+      <w:rPr>
+        <w:rFonts w:ascii="Courier New" w:hAnsi="Courier New" w:cs="Courier New" w:hint="default"/>
+      </w:rPr>
+    </w:lvl>
+    <w:lvl w:ilvl="5" w:tplc="04160005" w:tentative="1">
+      <w:start w:val="1"/>
+      <w:numFmt w:val="bullet"/>
+      <w:lvlText w:val=""/>
+      <w:lvlJc w:val="left"/>
+      <w:pPr>
+        <w:ind w:left="4320" w:hanging="360"/>
+      </w:pPr>
+      <w:rPr>
+        <w:rFonts w:ascii="Wingdings" w:hAnsi="Wingdings" w:hint="default"/>
+      </w:rPr>
+    </w:lvl>
+    <w:lvl w:ilvl="6" w:tplc="04160001" w:tentative="1">
+      <w:start w:val="1"/>
+      <w:numFmt w:val="bullet"/>
+      <w:lvlText w:val=""/>
+      <w:lvlJc w:val="left"/>
+      <w:pPr>
+        <w:ind w:left="5040" w:hanging="360"/>
+      </w:pPr>
+      <w:rPr>
+        <w:rFonts w:ascii="Symbol" w:hAnsi="Symbol" w:hint="default"/>
+      </w:rPr>
+    </w:lvl>
+    <w:lvl w:ilvl="7" w:tplc="04160003" w:tentative="1">
+      <w:start w:val="1"/>
+      <w:numFmt w:val="bullet"/>
+      <w:lvlText w:val="o"/>
+      <w:lvlJc w:val="left"/>
+      <w:pPr>
+        <w:ind w:left="5760" w:hanging="360"/>
+      </w:pPr>
+      <w:rPr>
+        <w:rFonts w:ascii="Courier New" w:hAnsi="Courier New" w:cs="Courier New" w:hint="default"/>
+      </w:rPr>
+    </w:lvl>
+    <w:lvl w:ilvl="8" w:tplc="04160005" w:tentative="1">
+      <w:start w:val="1"/>
+      <w:numFmt w:val="bullet"/>
+      <w:lvlText w:val=""/>
+      <w:lvlJc w:val="left"/>
+      <w:pPr>
+        <w:ind w:left="6480" w:hanging="360"/>
+      </w:pPr>
+      <w:rPr>
+        <w:rFonts w:ascii="Wingdings" w:hAnsi="Wingdings" w:hint="default"/>
+      </w:rPr>
+    </w:lvl>
+  </w:abstractNum>
+  <w:abstractNum w:abstractNumId="2" w15:restartNumberingAfterBreak="0">
+    <w:nsid w:val="60875BFB"/>
+    <w:multiLevelType w:val="hybridMultilevel"/>
+    <w:tmpl w:val="16A2C326"/>
+    <w:lvl w:ilvl="0" w:tplc="32684DD6">
+      <w:start w:val="18"/>
+      <w:numFmt w:val="decimal"/>
+      <w:lvlText w:val="%1)"/>
+      <w:lvlJc w:val="left"/>
+      <w:pPr>
+        <w:ind w:left="927" w:hanging="360"/>
+      </w:pPr>
+      <w:rPr>
+        <w:rFonts w:hint="default"/>
+      </w:rPr>
+    </w:lvl>
+    <w:lvl w:ilvl="1" w:tplc="04160019" w:tentative="1">
+      <w:start w:val="1"/>
+      <w:numFmt w:val="lowerLetter"/>
+      <w:lvlText w:val="%2."/>
+      <w:lvlJc w:val="left"/>
+      <w:pPr>
+        <w:ind w:left="1647" w:hanging="360"/>
+      </w:pPr>
+    </w:lvl>
+    <w:lvl w:ilvl="2" w:tplc="0416001B" w:tentative="1">
+      <w:start w:val="1"/>
+      <w:numFmt w:val="lowerRoman"/>
+      <w:lvlText w:val="%3."/>
+      <w:lvlJc w:val="right"/>
+      <w:pPr>
+        <w:ind w:left="2367" w:hanging="180"/>
+      </w:pPr>
+    </w:lvl>
+    <w:lvl w:ilvl="3" w:tplc="0416000F" w:tentative="1">
+      <w:start w:val="1"/>
+      <w:numFmt w:val="decimal"/>
+      <w:lvlText w:val="%4."/>
+      <w:lvlJc w:val="left"/>
+      <w:pPr>
+        <w:ind w:left="3087" w:hanging="360"/>
+      </w:pPr>
+    </w:lvl>
+    <w:lvl w:ilvl="4" w:tplc="04160019" w:tentative="1">
+      <w:start w:val="1"/>
+      <w:numFmt w:val="lowerLetter"/>
+      <w:lvlText w:val="%5."/>
+      <w:lvlJc w:val="left"/>
+      <w:pPr>
+        <w:ind w:left="3807" w:hanging="360"/>
+      </w:pPr>
+    </w:lvl>
+    <w:lvl w:ilvl="5" w:tplc="0416001B" w:tentative="1">
+      <w:start w:val="1"/>
+      <w:numFmt w:val="lowerRoman"/>
+      <w:lvlText w:val="%6."/>
+      <w:lvlJc w:val="right"/>
+      <w:pPr>
+        <w:ind w:left="4527" w:hanging="180"/>
+      </w:pPr>
+    </w:lvl>
+    <w:lvl w:ilvl="6" w:tplc="0416000F" w:tentative="1">
+      <w:start w:val="1"/>
+      <w:numFmt w:val="decimal"/>
+      <w:lvlText w:val="%7."/>
+      <w:lvlJc w:val="left"/>
+      <w:pPr>
+        <w:ind w:left="5247" w:hanging="360"/>
+      </w:pPr>
+    </w:lvl>
+    <w:lvl w:ilvl="7" w:tplc="04160019" w:tentative="1">
+      <w:start w:val="1"/>
+      <w:numFmt w:val="lowerLetter"/>
+      <w:lvlText w:val="%8."/>
+      <w:lvlJc w:val="left"/>
+      <w:pPr>
+        <w:ind w:left="5967" w:hanging="360"/>
+      </w:pPr>
+    </w:lvl>
+    <w:lvl w:ilvl="8" w:tplc="0416001B" w:tentative="1">
+      <w:start w:val="1"/>
+      <w:numFmt w:val="lowerRoman"/>
+      <w:lvlText w:val="%9."/>
+      <w:lvlJc w:val="right"/>
+      <w:pPr>
+        <w:ind w:left="6687" w:hanging="180"/>
+      </w:pPr>
+    </w:lvl>
+  </w:abstractNum>
+  <w:abstractNum w:abstractNumId="3" w15:restartNumberingAfterBreak="0">
     <w:nsid w:val="68196124"/>
     <w:multiLevelType w:val="hybridMultilevel"/>
     <w:tmpl w:val="CCFA2514"/>
@@ -2081,6 +2828,12 @@
     <w:abstractNumId w:val="0"/>
   </w:num>
   <w:num w:numId="2">
+    <w:abstractNumId w:val="3"/>
+  </w:num>
+  <w:num w:numId="3">
+    <w:abstractNumId w:val="2"/>
+  </w:num>
+  <w:num w:numId="4">
     <w:abstractNumId w:val="1"/>
   </w:num>
 </w:numbering>
@@ -2487,6 +3240,7 @@
   <w:style w:type="character" w:default="1" w:styleId="Fontepargpadro">
     <w:name w:val="Default Paragraph Font"/>
     <w:uiPriority w:val="1"/>
+    <w:semiHidden/>
     <w:unhideWhenUsed/>
   </w:style>
   <w:style w:type="table" w:default="1" w:styleId="Tabelanormal">

</xml_diff>

<commit_message>
Adiciona arquivos do projeto
</commit_message>
<xml_diff>
--- a/Apostila/apostila.docx
+++ b/Apostila/apostila.docx
@@ -1921,6 +1921,9 @@
         <w:ind w:left="927"/>
       </w:pPr>
       <w:r>
+        <w:rPr>
+          <w:noProof/>
+        </w:rPr>
         <w:drawing>
           <wp:inline distT="0" distB="0" distL="0" distR="0" wp14:anchorId="31E82AB0" wp14:editId="148890BE">
             <wp:extent cx="4363059" cy="1590897"/>
@@ -2005,6 +2008,9 @@
         <w:br/>
       </w:r>
       <w:r>
+        <w:rPr>
+          <w:noProof/>
+        </w:rPr>
         <w:drawing>
           <wp:inline distT="0" distB="0" distL="0" distR="0" wp14:anchorId="4FB71980" wp14:editId="0E62C45D">
             <wp:extent cx="3010320" cy="771633"/>
@@ -2087,6 +2093,9 @@
         <w:br/>
       </w:r>
       <w:r>
+        <w:rPr>
+          <w:noProof/>
+        </w:rPr>
         <w:drawing>
           <wp:inline distT="0" distB="0" distL="0" distR="0" wp14:anchorId="5C3D1E87" wp14:editId="012FC8A6">
             <wp:extent cx="2562583" cy="1324160"/>
@@ -2161,6 +2170,9 @@
         <w:br/>
       </w:r>
       <w:r>
+        <w:rPr>
+          <w:noProof/>
+        </w:rPr>
         <w:drawing>
           <wp:inline distT="0" distB="0" distL="0" distR="0" wp14:anchorId="66DB025B" wp14:editId="56CF573F">
             <wp:extent cx="2276793" cy="800212"/>
@@ -2265,6 +2277,9 @@
         </w:tabs>
       </w:pPr>
       <w:r>
+        <w:rPr>
+          <w:noProof/>
+        </w:rPr>
         <w:drawing>
           <wp:anchor distT="0" distB="0" distL="114300" distR="114300" simplePos="0" relativeHeight="251668480" behindDoc="0" locked="0" layoutInCell="1" allowOverlap="1" wp14:anchorId="4B54C572">
             <wp:simplePos x="0" y="0"/>
@@ -2409,6 +2424,780 @@
           <w:tab w:val="left" w:pos="915"/>
         </w:tabs>
       </w:pPr>
+      <w:r>
+        <w:t>Trabalhando com posicionamento</w:t>
+      </w:r>
+    </w:p>
+    <w:p>
+      <w:pPr>
+        <w:pStyle w:val="PargrafodaLista"/>
+        <w:numPr>
+          <w:ilvl w:val="0"/>
+          <w:numId w:val="6"/>
+        </w:numPr>
+        <w:tabs>
+          <w:tab w:val="left" w:pos="915"/>
+        </w:tabs>
+      </w:pPr>
+      <w:r>
+        <w:drawing>
+          <wp:anchor distT="0" distB="0" distL="114300" distR="114300" simplePos="0" relativeHeight="251669504" behindDoc="0" locked="0" layoutInCell="1" allowOverlap="1" wp14:anchorId="26F5D7D3">
+            <wp:simplePos x="0" y="0"/>
+            <wp:positionH relativeFrom="column">
+              <wp:posOffset>3653790</wp:posOffset>
+            </wp:positionH>
+            <wp:positionV relativeFrom="paragraph">
+              <wp:posOffset>3175</wp:posOffset>
+            </wp:positionV>
+            <wp:extent cx="2124371" cy="1028844"/>
+            <wp:effectExtent l="0" t="0" r="0" b="0"/>
+            <wp:wrapThrough wrapText="bothSides">
+              <wp:wrapPolygon edited="0">
+                <wp:start x="0" y="0"/>
+                <wp:lineTo x="0" y="21200"/>
+                <wp:lineTo x="21309" y="21200"/>
+                <wp:lineTo x="21309" y="0"/>
+                <wp:lineTo x="0" y="0"/>
+              </wp:wrapPolygon>
+            </wp:wrapThrough>
+            <wp:docPr id="22" name="Imagem 22"/>
+            <wp:cNvGraphicFramePr>
+              <a:graphicFrameLocks xmlns:a="http://schemas.openxmlformats.org/drawingml/2006/main" noChangeAspect="1"/>
+            </wp:cNvGraphicFramePr>
+            <a:graphic xmlns:a="http://schemas.openxmlformats.org/drawingml/2006/main">
+              <a:graphicData uri="http://schemas.openxmlformats.org/drawingml/2006/picture">
+                <pic:pic xmlns:pic="http://schemas.openxmlformats.org/drawingml/2006/picture">
+                  <pic:nvPicPr>
+                    <pic:cNvPr id="1" name=""/>
+                    <pic:cNvPicPr/>
+                  </pic:nvPicPr>
+                  <pic:blipFill>
+                    <a:blip r:embed="rId25">
+                      <a:extLst>
+                        <a:ext uri="{28A0092B-C50C-407E-A947-70E740481C1C}">
+                          <a14:useLocalDpi xmlns:a14="http://schemas.microsoft.com/office/drawing/2010/main" val="0"/>
+                        </a:ext>
+                      </a:extLst>
+                    </a:blip>
+                    <a:stretch>
+                      <a:fillRect/>
+                    </a:stretch>
+                  </pic:blipFill>
+                  <pic:spPr>
+                    <a:xfrm>
+                      <a:off x="0" y="0"/>
+                      <a:ext cx="2124371" cy="1028844"/>
+                    </a:xfrm>
+                    <a:prstGeom prst="rect">
+                      <a:avLst/>
+                    </a:prstGeom>
+                  </pic:spPr>
+                </pic:pic>
+              </a:graphicData>
+            </a:graphic>
+          </wp:anchor>
+        </w:drawing>
+      </w:r>
+      <w:proofErr w:type="spellStart"/>
+      <w:r>
+        <w:t>Static</w:t>
+      </w:r>
+      <w:proofErr w:type="spellEnd"/>
+    </w:p>
+    <w:p>
+      <w:pPr>
+        <w:pStyle w:val="PargrafodaLista"/>
+        <w:numPr>
+          <w:ilvl w:val="0"/>
+          <w:numId w:val="5"/>
+        </w:numPr>
+        <w:tabs>
+          <w:tab w:val="left" w:pos="915"/>
+        </w:tabs>
+      </w:pPr>
+      <w:proofErr w:type="spellStart"/>
+      <w:r>
+        <w:t>Relative</w:t>
+      </w:r>
+      <w:proofErr w:type="spellEnd"/>
+    </w:p>
+    <w:p>
+      <w:pPr>
+        <w:pStyle w:val="PargrafodaLista"/>
+        <w:numPr>
+          <w:ilvl w:val="0"/>
+          <w:numId w:val="5"/>
+        </w:numPr>
+        <w:tabs>
+          <w:tab w:val="left" w:pos="915"/>
+        </w:tabs>
+      </w:pPr>
+      <w:proofErr w:type="spellStart"/>
+      <w:r>
+        <w:t>Absolute</w:t>
+      </w:r>
+      <w:proofErr w:type="spellEnd"/>
+    </w:p>
+    <w:p>
+      <w:pPr>
+        <w:tabs>
+          <w:tab w:val="left" w:pos="915"/>
+        </w:tabs>
+        <w:spacing w:after="0"/>
+        <w:ind w:left="927"/>
+      </w:pPr>
+      <w:r>
+        <w:t xml:space="preserve">Na </w:t>
+      </w:r>
+      <w:r>
+        <w:rPr>
+          <w:b/>
+        </w:rPr>
+        <w:t xml:space="preserve">position </w:t>
+      </w:r>
+      <w:proofErr w:type="spellStart"/>
+      <w:r>
+        <w:rPr>
+          <w:b/>
+        </w:rPr>
+        <w:t>static</w:t>
+      </w:r>
+      <w:proofErr w:type="spellEnd"/>
+      <w:r>
+        <w:t xml:space="preserve"> -&gt; como o nome diz: a posição fica parada no ponto inicial.</w:t>
+      </w:r>
+    </w:p>
+    <w:p>
+      <w:pPr>
+        <w:tabs>
+          <w:tab w:val="left" w:pos="915"/>
+        </w:tabs>
+        <w:spacing w:after="0"/>
+        <w:ind w:left="927"/>
+      </w:pPr>
+      <w:r>
+        <w:drawing>
+          <wp:anchor distT="0" distB="0" distL="114300" distR="114300" simplePos="0" relativeHeight="251670528" behindDoc="0" locked="0" layoutInCell="1" allowOverlap="1" wp14:anchorId="2730805C">
+            <wp:simplePos x="0" y="0"/>
+            <wp:positionH relativeFrom="column">
+              <wp:posOffset>3044190</wp:posOffset>
+            </wp:positionH>
+            <wp:positionV relativeFrom="paragraph">
+              <wp:posOffset>9525</wp:posOffset>
+            </wp:positionV>
+            <wp:extent cx="3352800" cy="735965"/>
+            <wp:effectExtent l="0" t="0" r="0" b="6985"/>
+            <wp:wrapThrough wrapText="bothSides">
+              <wp:wrapPolygon edited="0">
+                <wp:start x="0" y="0"/>
+                <wp:lineTo x="0" y="21246"/>
+                <wp:lineTo x="21477" y="21246"/>
+                <wp:lineTo x="21477" y="0"/>
+                <wp:lineTo x="0" y="0"/>
+              </wp:wrapPolygon>
+            </wp:wrapThrough>
+            <wp:docPr id="23" name="Imagem 23"/>
+            <wp:cNvGraphicFramePr>
+              <a:graphicFrameLocks xmlns:a="http://schemas.openxmlformats.org/drawingml/2006/main" noChangeAspect="1"/>
+            </wp:cNvGraphicFramePr>
+            <a:graphic xmlns:a="http://schemas.openxmlformats.org/drawingml/2006/main">
+              <a:graphicData uri="http://schemas.openxmlformats.org/drawingml/2006/picture">
+                <pic:pic xmlns:pic="http://schemas.openxmlformats.org/drawingml/2006/picture">
+                  <pic:nvPicPr>
+                    <pic:cNvPr id="1" name=""/>
+                    <pic:cNvPicPr/>
+                  </pic:nvPicPr>
+                  <pic:blipFill>
+                    <a:blip r:embed="rId26" cstate="print">
+                      <a:extLst>
+                        <a:ext uri="{28A0092B-C50C-407E-A947-70E740481C1C}">
+                          <a14:useLocalDpi xmlns:a14="http://schemas.microsoft.com/office/drawing/2010/main" val="0"/>
+                        </a:ext>
+                      </a:extLst>
+                    </a:blip>
+                    <a:stretch>
+                      <a:fillRect/>
+                    </a:stretch>
+                  </pic:blipFill>
+                  <pic:spPr>
+                    <a:xfrm>
+                      <a:off x="0" y="0"/>
+                      <a:ext cx="3352800" cy="735965"/>
+                    </a:xfrm>
+                    <a:prstGeom prst="rect">
+                      <a:avLst/>
+                    </a:prstGeom>
+                  </pic:spPr>
+                </pic:pic>
+              </a:graphicData>
+            </a:graphic>
+            <wp14:sizeRelH relativeFrom="margin">
+              <wp14:pctWidth>0</wp14:pctWidth>
+            </wp14:sizeRelH>
+            <wp14:sizeRelV relativeFrom="margin">
+              <wp14:pctHeight>0</wp14:pctHeight>
+            </wp14:sizeRelV>
+          </wp:anchor>
+        </w:drawing>
+      </w:r>
+      <w:r>
+        <w:t xml:space="preserve">Na </w:t>
+      </w:r>
+      <w:r>
+        <w:rPr>
+          <w:b/>
+        </w:rPr>
+        <w:t xml:space="preserve">position </w:t>
+      </w:r>
+      <w:proofErr w:type="spellStart"/>
+      <w:r>
+        <w:rPr>
+          <w:b/>
+        </w:rPr>
+        <w:t>relative</w:t>
+      </w:r>
+      <w:proofErr w:type="spellEnd"/>
+      <w:r>
+        <w:t xml:space="preserve"> -&gt; ele anda conforme sua posição original.</w:t>
+      </w:r>
+    </w:p>
+    <w:p>
+      <w:pPr>
+        <w:tabs>
+          <w:tab w:val="left" w:pos="915"/>
+        </w:tabs>
+        <w:spacing w:after="0"/>
+        <w:ind w:left="927"/>
+      </w:pPr>
+      <w:r>
+        <w:t xml:space="preserve">Na </w:t>
+      </w:r>
+      <w:r>
+        <w:rPr>
+          <w:b/>
+        </w:rPr>
+        <w:t xml:space="preserve">position </w:t>
+      </w:r>
+      <w:proofErr w:type="spellStart"/>
+      <w:r>
+        <w:rPr>
+          <w:b/>
+        </w:rPr>
+        <w:t>absolute</w:t>
+      </w:r>
+      <w:proofErr w:type="spellEnd"/>
+      <w:r>
+        <w:t xml:space="preserve"> -&gt; é absoluto ao site, ignorando a posição inicial.</w:t>
+      </w:r>
+    </w:p>
+    <w:p>
+      <w:pPr>
+        <w:tabs>
+          <w:tab w:val="left" w:pos="915"/>
+        </w:tabs>
+        <w:spacing w:after="0"/>
+        <w:ind w:left="927"/>
+      </w:pPr>
+    </w:p>
+    <w:p>
+      <w:pPr>
+        <w:pStyle w:val="PargrafodaLista"/>
+        <w:numPr>
+          <w:ilvl w:val="0"/>
+          <w:numId w:val="3"/>
+        </w:numPr>
+        <w:tabs>
+          <w:tab w:val="left" w:pos="915"/>
+        </w:tabs>
+        <w:spacing w:after="0"/>
+      </w:pPr>
+      <w:r>
+        <w:lastRenderedPageBreak/>
+        <w:t xml:space="preserve">Para resetar o </w:t>
+      </w:r>
+      <w:proofErr w:type="spellStart"/>
+      <w:r>
+        <w:t>css</w:t>
+      </w:r>
+      <w:proofErr w:type="spellEnd"/>
+      <w:r>
+        <w:t xml:space="preserve"> dos navegadores, utilizamos o reset.css que pegamos do seguinte site:</w:t>
+      </w:r>
+      <w:r>
+        <w:br/>
+      </w:r>
+      <w:r>
+        <w:t>https://meyerweb.com/eric/tools/css/reset/</w:t>
+      </w:r>
+      <w:r>
+        <w:br/>
+      </w:r>
+      <w:r>
+        <w:drawing>
+          <wp:inline distT="0" distB="0" distL="0" distR="0" wp14:anchorId="648844ED" wp14:editId="4E9A1B87">
+            <wp:extent cx="3152775" cy="3682563"/>
+            <wp:effectExtent l="0" t="0" r="0" b="0"/>
+            <wp:docPr id="26" name="Imagem 26"/>
+            <wp:cNvGraphicFramePr>
+              <a:graphicFrameLocks xmlns:a="http://schemas.openxmlformats.org/drawingml/2006/main" noChangeAspect="1"/>
+            </wp:cNvGraphicFramePr>
+            <a:graphic xmlns:a="http://schemas.openxmlformats.org/drawingml/2006/main">
+              <a:graphicData uri="http://schemas.openxmlformats.org/drawingml/2006/picture">
+                <pic:pic xmlns:pic="http://schemas.openxmlformats.org/drawingml/2006/picture">
+                  <pic:nvPicPr>
+                    <pic:cNvPr id="1" name=""/>
+                    <pic:cNvPicPr/>
+                  </pic:nvPicPr>
+                  <pic:blipFill>
+                    <a:blip r:embed="rId27"/>
+                    <a:stretch>
+                      <a:fillRect/>
+                    </a:stretch>
+                  </pic:blipFill>
+                  <pic:spPr>
+                    <a:xfrm>
+                      <a:off x="0" y="0"/>
+                      <a:ext cx="3158776" cy="3689572"/>
+                    </a:xfrm>
+                    <a:prstGeom prst="rect">
+                      <a:avLst/>
+                    </a:prstGeom>
+                  </pic:spPr>
+                </pic:pic>
+              </a:graphicData>
+            </a:graphic>
+          </wp:inline>
+        </w:drawing>
+      </w:r>
+    </w:p>
+    <w:p>
+      <w:pPr>
+        <w:pStyle w:val="PargrafodaLista"/>
+        <w:tabs>
+          <w:tab w:val="left" w:pos="915"/>
+        </w:tabs>
+        <w:spacing w:after="0"/>
+        <w:ind w:left="927"/>
+      </w:pPr>
+      <w:r>
+        <w:t xml:space="preserve">No </w:t>
+      </w:r>
+      <w:proofErr w:type="spellStart"/>
+      <w:r>
+        <w:t>VSCode</w:t>
+      </w:r>
+      <w:proofErr w:type="spellEnd"/>
+      <w:r>
+        <w:t>, adicionamos um novo arquivo chamado reset.css conforme a imagem acima, e colocamos os códigos da imagem nele.</w:t>
+      </w:r>
+      <w:r>
+        <w:br/>
+      </w:r>
+      <w:r>
+        <w:drawing>
+          <wp:inline distT="0" distB="0" distL="0" distR="0" wp14:anchorId="558D62B4" wp14:editId="021E00F0">
+            <wp:extent cx="2638793" cy="1228896"/>
+            <wp:effectExtent l="0" t="0" r="9525" b="9525"/>
+            <wp:docPr id="27" name="Imagem 27"/>
+            <wp:cNvGraphicFramePr>
+              <a:graphicFrameLocks xmlns:a="http://schemas.openxmlformats.org/drawingml/2006/main" noChangeAspect="1"/>
+            </wp:cNvGraphicFramePr>
+            <a:graphic xmlns:a="http://schemas.openxmlformats.org/drawingml/2006/main">
+              <a:graphicData uri="http://schemas.openxmlformats.org/drawingml/2006/picture">
+                <pic:pic xmlns:pic="http://schemas.openxmlformats.org/drawingml/2006/picture">
+                  <pic:nvPicPr>
+                    <pic:cNvPr id="1" name=""/>
+                    <pic:cNvPicPr/>
+                  </pic:nvPicPr>
+                  <pic:blipFill>
+                    <a:blip r:embed="rId28"/>
+                    <a:stretch>
+                      <a:fillRect/>
+                    </a:stretch>
+                  </pic:blipFill>
+                  <pic:spPr>
+                    <a:xfrm>
+                      <a:off x="0" y="0"/>
+                      <a:ext cx="2638793" cy="1228896"/>
+                    </a:xfrm>
+                    <a:prstGeom prst="rect">
+                      <a:avLst/>
+                    </a:prstGeom>
+                  </pic:spPr>
+                </pic:pic>
+              </a:graphicData>
+            </a:graphic>
+          </wp:inline>
+        </w:drawing>
+      </w:r>
+    </w:p>
+    <w:p>
+      <w:pPr>
+        <w:pStyle w:val="PargrafodaLista"/>
+        <w:tabs>
+          <w:tab w:val="left" w:pos="915"/>
+        </w:tabs>
+        <w:spacing w:after="0"/>
+        <w:ind w:left="927"/>
+      </w:pPr>
+    </w:p>
+    <w:p>
+      <w:pPr>
+        <w:pStyle w:val="PargrafodaLista"/>
+        <w:tabs>
+          <w:tab w:val="left" w:pos="915"/>
+        </w:tabs>
+        <w:spacing w:after="0"/>
+        <w:ind w:left="927"/>
+      </w:pPr>
+    </w:p>
+    <w:p>
+      <w:pPr>
+        <w:pStyle w:val="PargrafodaLista"/>
+        <w:tabs>
+          <w:tab w:val="left" w:pos="915"/>
+        </w:tabs>
+        <w:spacing w:after="0"/>
+        <w:ind w:left="927"/>
+      </w:pPr>
+      <w:proofErr w:type="spellStart"/>
+      <w:r>
+        <w:t>Obs</w:t>
+      </w:r>
+      <w:proofErr w:type="spellEnd"/>
+      <w:r>
+        <w:t xml:space="preserve">: O reset.css deve sempre ficar na parte acima do nosso </w:t>
+      </w:r>
+      <w:proofErr w:type="spellStart"/>
+      <w:proofErr w:type="gramStart"/>
+      <w:r>
+        <w:t>css</w:t>
+      </w:r>
+      <w:proofErr w:type="spellEnd"/>
+      <w:r>
+        <w:t>(</w:t>
+      </w:r>
+      <w:proofErr w:type="gramEnd"/>
+      <w:r>
+        <w:t>da página)</w:t>
+      </w:r>
+    </w:p>
+    <w:p>
+      <w:pPr>
+        <w:pStyle w:val="PargrafodaLista"/>
+        <w:tabs>
+          <w:tab w:val="left" w:pos="915"/>
+        </w:tabs>
+        <w:spacing w:after="0"/>
+        <w:ind w:left="927"/>
+      </w:pPr>
+      <w:r>
+        <w:drawing>
+          <wp:inline distT="0" distB="0" distL="0" distR="0" wp14:anchorId="044BB79C" wp14:editId="58B06D0F">
+            <wp:extent cx="3905795" cy="733527"/>
+            <wp:effectExtent l="0" t="0" r="0" b="9525"/>
+            <wp:docPr id="24" name="Imagem 24"/>
+            <wp:cNvGraphicFramePr>
+              <a:graphicFrameLocks xmlns:a="http://schemas.openxmlformats.org/drawingml/2006/main" noChangeAspect="1"/>
+            </wp:cNvGraphicFramePr>
+            <a:graphic xmlns:a="http://schemas.openxmlformats.org/drawingml/2006/main">
+              <a:graphicData uri="http://schemas.openxmlformats.org/drawingml/2006/picture">
+                <pic:pic xmlns:pic="http://schemas.openxmlformats.org/drawingml/2006/picture">
+                  <pic:nvPicPr>
+                    <pic:cNvPr id="1" name=""/>
+                    <pic:cNvPicPr/>
+                  </pic:nvPicPr>
+                  <pic:blipFill>
+                    <a:blip r:embed="rId29"/>
+                    <a:stretch>
+                      <a:fillRect/>
+                    </a:stretch>
+                  </pic:blipFill>
+                  <pic:spPr>
+                    <a:xfrm>
+                      <a:off x="0" y="0"/>
+                      <a:ext cx="3905795" cy="733527"/>
+                    </a:xfrm>
+                    <a:prstGeom prst="rect">
+                      <a:avLst/>
+                    </a:prstGeom>
+                  </pic:spPr>
+                </pic:pic>
+              </a:graphicData>
+            </a:graphic>
+          </wp:inline>
+        </w:drawing>
+      </w:r>
+    </w:p>
+    <w:p>
+      <w:pPr>
+        <w:pStyle w:val="PargrafodaLista"/>
+        <w:tabs>
+          <w:tab w:val="left" w:pos="915"/>
+        </w:tabs>
+        <w:spacing w:after="0"/>
+        <w:ind w:left="927"/>
+      </w:pPr>
+    </w:p>
+    <w:p>
+      <w:pPr>
+        <w:pStyle w:val="PargrafodaLista"/>
+        <w:numPr>
+          <w:ilvl w:val="0"/>
+          <w:numId w:val="3"/>
+        </w:numPr>
+        <w:tabs>
+          <w:tab w:val="left" w:pos="915"/>
+        </w:tabs>
+        <w:spacing w:after="0"/>
+      </w:pPr>
+      <w:r>
+        <w:t xml:space="preserve">Para centralizar e o menu dentro do header, </w:t>
+      </w:r>
+      <w:r>
+        <w:t>utilizamos uma &lt;</w:t>
+      </w:r>
+      <w:proofErr w:type="spellStart"/>
+      <w:r>
+        <w:t>div</w:t>
+      </w:r>
+      <w:proofErr w:type="spellEnd"/>
+      <w:r>
+        <w:t xml:space="preserve"> </w:t>
+      </w:r>
+      <w:proofErr w:type="spellStart"/>
+      <w:proofErr w:type="gramStart"/>
+      <w:r>
+        <w:t>class”caixa</w:t>
+      </w:r>
+      <w:proofErr w:type="spellEnd"/>
+      <w:proofErr w:type="gramEnd"/>
+      <w:r>
+        <w:t>”&gt;.</w:t>
+      </w:r>
+      <w:r>
+        <w:br/>
+      </w:r>
+      <w:r>
+        <w:drawing>
+          <wp:inline distT="0" distB="0" distL="0" distR="0" wp14:anchorId="5DD834C1" wp14:editId="0B60E4E6">
+            <wp:extent cx="2836903" cy="1209675"/>
+            <wp:effectExtent l="0" t="0" r="1905" b="0"/>
+            <wp:docPr id="28" name="Imagem 28"/>
+            <wp:cNvGraphicFramePr>
+              <a:graphicFrameLocks xmlns:a="http://schemas.openxmlformats.org/drawingml/2006/main" noChangeAspect="1"/>
+            </wp:cNvGraphicFramePr>
+            <a:graphic xmlns:a="http://schemas.openxmlformats.org/drawingml/2006/main">
+              <a:graphicData uri="http://schemas.openxmlformats.org/drawingml/2006/picture">
+                <pic:pic xmlns:pic="http://schemas.openxmlformats.org/drawingml/2006/picture">
+                  <pic:nvPicPr>
+                    <pic:cNvPr id="1" name=""/>
+                    <pic:cNvPicPr/>
+                  </pic:nvPicPr>
+                  <pic:blipFill>
+                    <a:blip r:embed="rId30"/>
+                    <a:stretch>
+                      <a:fillRect/>
+                    </a:stretch>
+                  </pic:blipFill>
+                  <pic:spPr>
+                    <a:xfrm>
+                      <a:off x="0" y="0"/>
+                      <a:ext cx="2860222" cy="1219618"/>
+                    </a:xfrm>
+                    <a:prstGeom prst="rect">
+                      <a:avLst/>
+                    </a:prstGeom>
+                  </pic:spPr>
+                </pic:pic>
+              </a:graphicData>
+            </a:graphic>
+          </wp:inline>
+        </w:drawing>
+      </w:r>
+    </w:p>
+    <w:p>
+      <w:pPr>
+        <w:pStyle w:val="PargrafodaLista"/>
+        <w:numPr>
+          <w:ilvl w:val="0"/>
+          <w:numId w:val="3"/>
+        </w:numPr>
+        <w:tabs>
+          <w:tab w:val="left" w:pos="915"/>
+        </w:tabs>
+        <w:spacing w:after="0"/>
+      </w:pPr>
+      <w:r>
+        <w:lastRenderedPageBreak/>
+        <w:t xml:space="preserve">No </w:t>
+      </w:r>
+      <w:proofErr w:type="spellStart"/>
+      <w:r>
+        <w:t>css</w:t>
+      </w:r>
+      <w:proofErr w:type="spellEnd"/>
+      <w:r>
+        <w:t xml:space="preserve">, na </w:t>
+      </w:r>
+      <w:proofErr w:type="spellStart"/>
+      <w:r>
+        <w:t>div</w:t>
+      </w:r>
+      <w:proofErr w:type="spellEnd"/>
+      <w:r>
+        <w:t xml:space="preserve"> </w:t>
+      </w:r>
+      <w:proofErr w:type="gramStart"/>
+      <w:r>
+        <w:t>“.caixa</w:t>
+      </w:r>
+      <w:proofErr w:type="gramEnd"/>
+      <w:r>
+        <w:t>{}” nós:</w:t>
+      </w:r>
+    </w:p>
+    <w:p>
+      <w:pPr>
+        <w:pStyle w:val="PargrafodaLista"/>
+        <w:numPr>
+          <w:ilvl w:val="0"/>
+          <w:numId w:val="7"/>
+        </w:numPr>
+        <w:tabs>
+          <w:tab w:val="left" w:pos="915"/>
+        </w:tabs>
+        <w:spacing w:after="0"/>
+      </w:pPr>
+      <w:r>
+        <w:t xml:space="preserve">Definimos uma </w:t>
+      </w:r>
+      <w:r>
+        <w:rPr>
+          <w:b/>
+        </w:rPr>
+        <w:t>largura (</w:t>
+      </w:r>
+      <w:proofErr w:type="spellStart"/>
+      <w:r>
+        <w:rPr>
+          <w:b/>
+        </w:rPr>
+        <w:t>width</w:t>
+      </w:r>
+      <w:proofErr w:type="spellEnd"/>
+      <w:r>
+        <w:rPr>
+          <w:b/>
+        </w:rPr>
+        <w:t>) para 940px</w:t>
+      </w:r>
+    </w:p>
+    <w:p>
+      <w:pPr>
+        <w:pStyle w:val="PargrafodaLista"/>
+        <w:numPr>
+          <w:ilvl w:val="0"/>
+          <w:numId w:val="7"/>
+        </w:numPr>
+        <w:tabs>
+          <w:tab w:val="left" w:pos="915"/>
+        </w:tabs>
+        <w:spacing w:after="0"/>
+      </w:pPr>
+      <w:r>
+        <w:t>Utilizamos o “</w:t>
+      </w:r>
+      <w:proofErr w:type="spellStart"/>
+      <w:r>
+        <w:rPr>
+          <w:b/>
+        </w:rPr>
+        <w:t>margin</w:t>
+      </w:r>
+      <w:proofErr w:type="spellEnd"/>
+      <w:r>
+        <w:rPr>
+          <w:b/>
+        </w:rPr>
+        <w:t>: 0 auto;</w:t>
+      </w:r>
+      <w:r>
+        <w:t>” para deixar tanto o logo quanto o menu de forma centralizadas.</w:t>
+      </w:r>
+    </w:p>
+    <w:p>
+      <w:pPr>
+        <w:pStyle w:val="PargrafodaLista"/>
+        <w:numPr>
+          <w:ilvl w:val="0"/>
+          <w:numId w:val="7"/>
+        </w:numPr>
+        <w:tabs>
+          <w:tab w:val="left" w:pos="915"/>
+        </w:tabs>
+        <w:spacing w:after="0"/>
+      </w:pPr>
+      <w:r>
+        <w:t xml:space="preserve">E </w:t>
+      </w:r>
+      <w:r>
+        <w:rPr>
+          <w:b/>
+        </w:rPr>
+        <w:t xml:space="preserve">position </w:t>
+      </w:r>
+      <w:proofErr w:type="spellStart"/>
+      <w:r>
+        <w:rPr>
+          <w:b/>
+        </w:rPr>
+        <w:t>relative</w:t>
+      </w:r>
+      <w:proofErr w:type="spellEnd"/>
+      <w:r>
+        <w:t xml:space="preserve"> para o menu andar conforme sua posição</w:t>
+      </w:r>
+      <w:r>
+        <w:br/>
+      </w:r>
+      <w:r>
+        <w:drawing>
+          <wp:inline distT="0" distB="0" distL="0" distR="0" wp14:anchorId="791079CC" wp14:editId="081D9088">
+            <wp:extent cx="1771897" cy="914528"/>
+            <wp:effectExtent l="0" t="0" r="0" b="0"/>
+            <wp:docPr id="29" name="Imagem 29"/>
+            <wp:cNvGraphicFramePr>
+              <a:graphicFrameLocks xmlns:a="http://schemas.openxmlformats.org/drawingml/2006/main" noChangeAspect="1"/>
+            </wp:cNvGraphicFramePr>
+            <a:graphic xmlns:a="http://schemas.openxmlformats.org/drawingml/2006/main">
+              <a:graphicData uri="http://schemas.openxmlformats.org/drawingml/2006/picture">
+                <pic:pic xmlns:pic="http://schemas.openxmlformats.org/drawingml/2006/picture">
+                  <pic:nvPicPr>
+                    <pic:cNvPr id="1" name=""/>
+                    <pic:cNvPicPr/>
+                  </pic:nvPicPr>
+                  <pic:blipFill>
+                    <a:blip r:embed="rId31"/>
+                    <a:stretch>
+                      <a:fillRect/>
+                    </a:stretch>
+                  </pic:blipFill>
+                  <pic:spPr>
+                    <a:xfrm>
+                      <a:off x="0" y="0"/>
+                      <a:ext cx="1771897" cy="914528"/>
+                    </a:xfrm>
+                    <a:prstGeom prst="rect">
+                      <a:avLst/>
+                    </a:prstGeom>
+                  </pic:spPr>
+                </pic:pic>
+              </a:graphicData>
+            </a:graphic>
+          </wp:inline>
+        </w:drawing>
+      </w:r>
       <w:bookmarkStart w:id="0" w:name="_GoBack"/>
       <w:bookmarkEnd w:id="0"/>
     </w:p>
@@ -2425,6 +3214,232 @@
 <file path=word/numbering.xml><?xml version="1.0" encoding="utf-8"?>
 <w:numbering xmlns:wpc="http://schemas.microsoft.com/office/word/2010/wordprocessingCanvas" xmlns:cx="http://schemas.microsoft.com/office/drawing/2014/chartex" xmlns:cx1="http://schemas.microsoft.com/office/drawing/2015/9/8/chartex" xmlns:cx2="http://schemas.microsoft.com/office/drawing/2015/10/21/chartex" xmlns:cx3="http://schemas.microsoft.com/office/drawing/2016/5/9/chartex" xmlns:cx4="http://schemas.microsoft.com/office/drawing/2016/5/10/chartex" xmlns:cx5="http://schemas.microsoft.com/office/drawing/2016/5/11/chartex" xmlns:cx6="http://schemas.microsoft.com/office/drawing/2016/5/12/chartex" xmlns:cx7="http://schemas.microsoft.com/office/drawing/2016/5/13/chartex" xmlns:cx8="http://schemas.microsoft.com/office/drawing/2016/5/14/chartex" xmlns:mc="http://schemas.openxmlformats.org/markup-compatibility/2006" xmlns:aink="http://schemas.microsoft.com/office/drawing/2016/ink" xmlns:am3d="http://schemas.microsoft.com/office/drawing/2017/model3d" xmlns:o="urn:schemas-microsoft-com:office:office" xmlns:r="http://schemas.openxmlformats.org/officeDocument/2006/relationships" xmlns:m="http://schemas.openxmlformats.org/officeDocument/2006/math" xmlns:v="urn:schemas-microsoft-com:vml" xmlns:wp14="http://schemas.microsoft.com/office/word/2010/wordprocessingDrawing" xmlns:wp="http://schemas.openxmlformats.org/drawingml/2006/wordprocessingDrawing" xmlns:w10="urn:schemas-microsoft-com:office:word" xmlns:w="http://schemas.openxmlformats.org/wordprocessingml/2006/main" xmlns:w14="http://schemas.microsoft.com/office/word/2010/wordml" xmlns:w15="http://schemas.microsoft.com/office/word/2012/wordml" xmlns:w16cid="http://schemas.microsoft.com/office/word/2016/wordml/cid" xmlns:w16se="http://schemas.microsoft.com/office/word/2015/wordml/symex" xmlns:wpg="http://schemas.microsoft.com/office/word/2010/wordprocessingGroup" xmlns:wpi="http://schemas.microsoft.com/office/word/2010/wordprocessingInk" xmlns:wne="http://schemas.microsoft.com/office/word/2006/wordml" xmlns:wps="http://schemas.microsoft.com/office/word/2010/wordprocessingShape" mc:Ignorable="w14 w15 w16se w16cid wp14">
   <w:abstractNum w:abstractNumId="0" w15:restartNumberingAfterBreak="0">
+    <w:nsid w:val="01B231A7"/>
+    <w:multiLevelType w:val="hybridMultilevel"/>
+    <w:tmpl w:val="34CCDE28"/>
+    <w:lvl w:ilvl="0" w:tplc="04160001">
+      <w:start w:val="1"/>
+      <w:numFmt w:val="bullet"/>
+      <w:lvlText w:val=""/>
+      <w:lvlJc w:val="left"/>
+      <w:pPr>
+        <w:ind w:left="1287" w:hanging="360"/>
+      </w:pPr>
+      <w:rPr>
+        <w:rFonts w:ascii="Symbol" w:hAnsi="Symbol" w:hint="default"/>
+      </w:rPr>
+    </w:lvl>
+    <w:lvl w:ilvl="1" w:tplc="04160003" w:tentative="1">
+      <w:start w:val="1"/>
+      <w:numFmt w:val="bullet"/>
+      <w:lvlText w:val="o"/>
+      <w:lvlJc w:val="left"/>
+      <w:pPr>
+        <w:ind w:left="2007" w:hanging="360"/>
+      </w:pPr>
+      <w:rPr>
+        <w:rFonts w:ascii="Courier New" w:hAnsi="Courier New" w:cs="Courier New" w:hint="default"/>
+      </w:rPr>
+    </w:lvl>
+    <w:lvl w:ilvl="2" w:tplc="04160005" w:tentative="1">
+      <w:start w:val="1"/>
+      <w:numFmt w:val="bullet"/>
+      <w:lvlText w:val=""/>
+      <w:lvlJc w:val="left"/>
+      <w:pPr>
+        <w:ind w:left="2727" w:hanging="360"/>
+      </w:pPr>
+      <w:rPr>
+        <w:rFonts w:ascii="Wingdings" w:hAnsi="Wingdings" w:hint="default"/>
+      </w:rPr>
+    </w:lvl>
+    <w:lvl w:ilvl="3" w:tplc="04160001" w:tentative="1">
+      <w:start w:val="1"/>
+      <w:numFmt w:val="bullet"/>
+      <w:lvlText w:val=""/>
+      <w:lvlJc w:val="left"/>
+      <w:pPr>
+        <w:ind w:left="3447" w:hanging="360"/>
+      </w:pPr>
+      <w:rPr>
+        <w:rFonts w:ascii="Symbol" w:hAnsi="Symbol" w:hint="default"/>
+      </w:rPr>
+    </w:lvl>
+    <w:lvl w:ilvl="4" w:tplc="04160003" w:tentative="1">
+      <w:start w:val="1"/>
+      <w:numFmt w:val="bullet"/>
+      <w:lvlText w:val="o"/>
+      <w:lvlJc w:val="left"/>
+      <w:pPr>
+        <w:ind w:left="4167" w:hanging="360"/>
+      </w:pPr>
+      <w:rPr>
+        <w:rFonts w:ascii="Courier New" w:hAnsi="Courier New" w:cs="Courier New" w:hint="default"/>
+      </w:rPr>
+    </w:lvl>
+    <w:lvl w:ilvl="5" w:tplc="04160005" w:tentative="1">
+      <w:start w:val="1"/>
+      <w:numFmt w:val="bullet"/>
+      <w:lvlText w:val=""/>
+      <w:lvlJc w:val="left"/>
+      <w:pPr>
+        <w:ind w:left="4887" w:hanging="360"/>
+      </w:pPr>
+      <w:rPr>
+        <w:rFonts w:ascii="Wingdings" w:hAnsi="Wingdings" w:hint="default"/>
+      </w:rPr>
+    </w:lvl>
+    <w:lvl w:ilvl="6" w:tplc="04160001" w:tentative="1">
+      <w:start w:val="1"/>
+      <w:numFmt w:val="bullet"/>
+      <w:lvlText w:val=""/>
+      <w:lvlJc w:val="left"/>
+      <w:pPr>
+        <w:ind w:left="5607" w:hanging="360"/>
+      </w:pPr>
+      <w:rPr>
+        <w:rFonts w:ascii="Symbol" w:hAnsi="Symbol" w:hint="default"/>
+      </w:rPr>
+    </w:lvl>
+    <w:lvl w:ilvl="7" w:tplc="04160003" w:tentative="1">
+      <w:start w:val="1"/>
+      <w:numFmt w:val="bullet"/>
+      <w:lvlText w:val="o"/>
+      <w:lvlJc w:val="left"/>
+      <w:pPr>
+        <w:ind w:left="6327" w:hanging="360"/>
+      </w:pPr>
+      <w:rPr>
+        <w:rFonts w:ascii="Courier New" w:hAnsi="Courier New" w:cs="Courier New" w:hint="default"/>
+      </w:rPr>
+    </w:lvl>
+    <w:lvl w:ilvl="8" w:tplc="04160005" w:tentative="1">
+      <w:start w:val="1"/>
+      <w:numFmt w:val="bullet"/>
+      <w:lvlText w:val=""/>
+      <w:lvlJc w:val="left"/>
+      <w:pPr>
+        <w:ind w:left="7047" w:hanging="360"/>
+      </w:pPr>
+      <w:rPr>
+        <w:rFonts w:ascii="Wingdings" w:hAnsi="Wingdings" w:hint="default"/>
+      </w:rPr>
+    </w:lvl>
+  </w:abstractNum>
+  <w:abstractNum w:abstractNumId="1" w15:restartNumberingAfterBreak="0">
+    <w:nsid w:val="0A091DC1"/>
+    <w:multiLevelType w:val="hybridMultilevel"/>
+    <w:tmpl w:val="4E96538C"/>
+    <w:lvl w:ilvl="0" w:tplc="04160001">
+      <w:start w:val="1"/>
+      <w:numFmt w:val="bullet"/>
+      <w:lvlText w:val=""/>
+      <w:lvlJc w:val="left"/>
+      <w:pPr>
+        <w:ind w:left="1647" w:hanging="360"/>
+      </w:pPr>
+      <w:rPr>
+        <w:rFonts w:ascii="Symbol" w:hAnsi="Symbol" w:hint="default"/>
+      </w:rPr>
+    </w:lvl>
+    <w:lvl w:ilvl="1" w:tplc="04160003" w:tentative="1">
+      <w:start w:val="1"/>
+      <w:numFmt w:val="bullet"/>
+      <w:lvlText w:val="o"/>
+      <w:lvlJc w:val="left"/>
+      <w:pPr>
+        <w:ind w:left="2367" w:hanging="360"/>
+      </w:pPr>
+      <w:rPr>
+        <w:rFonts w:ascii="Courier New" w:hAnsi="Courier New" w:cs="Courier New" w:hint="default"/>
+      </w:rPr>
+    </w:lvl>
+    <w:lvl w:ilvl="2" w:tplc="04160005" w:tentative="1">
+      <w:start w:val="1"/>
+      <w:numFmt w:val="bullet"/>
+      <w:lvlText w:val=""/>
+      <w:lvlJc w:val="left"/>
+      <w:pPr>
+        <w:ind w:left="3087" w:hanging="360"/>
+      </w:pPr>
+      <w:rPr>
+        <w:rFonts w:ascii="Wingdings" w:hAnsi="Wingdings" w:hint="default"/>
+      </w:rPr>
+    </w:lvl>
+    <w:lvl w:ilvl="3" w:tplc="04160001" w:tentative="1">
+      <w:start w:val="1"/>
+      <w:numFmt w:val="bullet"/>
+      <w:lvlText w:val=""/>
+      <w:lvlJc w:val="left"/>
+      <w:pPr>
+        <w:ind w:left="3807" w:hanging="360"/>
+      </w:pPr>
+      <w:rPr>
+        <w:rFonts w:ascii="Symbol" w:hAnsi="Symbol" w:hint="default"/>
+      </w:rPr>
+    </w:lvl>
+    <w:lvl w:ilvl="4" w:tplc="04160003" w:tentative="1">
+      <w:start w:val="1"/>
+      <w:numFmt w:val="bullet"/>
+      <w:lvlText w:val="o"/>
+      <w:lvlJc w:val="left"/>
+      <w:pPr>
+        <w:ind w:left="4527" w:hanging="360"/>
+      </w:pPr>
+      <w:rPr>
+        <w:rFonts w:ascii="Courier New" w:hAnsi="Courier New" w:cs="Courier New" w:hint="default"/>
+      </w:rPr>
+    </w:lvl>
+    <w:lvl w:ilvl="5" w:tplc="04160005" w:tentative="1">
+      <w:start w:val="1"/>
+      <w:numFmt w:val="bullet"/>
+      <w:lvlText w:val=""/>
+      <w:lvlJc w:val="left"/>
+      <w:pPr>
+        <w:ind w:left="5247" w:hanging="360"/>
+      </w:pPr>
+      <w:rPr>
+        <w:rFonts w:ascii="Wingdings" w:hAnsi="Wingdings" w:hint="default"/>
+      </w:rPr>
+    </w:lvl>
+    <w:lvl w:ilvl="6" w:tplc="04160001" w:tentative="1">
+      <w:start w:val="1"/>
+      <w:numFmt w:val="bullet"/>
+      <w:lvlText w:val=""/>
+      <w:lvlJc w:val="left"/>
+      <w:pPr>
+        <w:ind w:left="5967" w:hanging="360"/>
+      </w:pPr>
+      <w:rPr>
+        <w:rFonts w:ascii="Symbol" w:hAnsi="Symbol" w:hint="default"/>
+      </w:rPr>
+    </w:lvl>
+    <w:lvl w:ilvl="7" w:tplc="04160003" w:tentative="1">
+      <w:start w:val="1"/>
+      <w:numFmt w:val="bullet"/>
+      <w:lvlText w:val="o"/>
+      <w:lvlJc w:val="left"/>
+      <w:pPr>
+        <w:ind w:left="6687" w:hanging="360"/>
+      </w:pPr>
+      <w:rPr>
+        <w:rFonts w:ascii="Courier New" w:hAnsi="Courier New" w:cs="Courier New" w:hint="default"/>
+      </w:rPr>
+    </w:lvl>
+    <w:lvl w:ilvl="8" w:tplc="04160005" w:tentative="1">
+      <w:start w:val="1"/>
+      <w:numFmt w:val="bullet"/>
+      <w:lvlText w:val=""/>
+      <w:lvlJc w:val="left"/>
+      <w:pPr>
+        <w:ind w:left="7407" w:hanging="360"/>
+      </w:pPr>
+      <w:rPr>
+        <w:rFonts w:ascii="Wingdings" w:hAnsi="Wingdings" w:hint="default"/>
+      </w:rPr>
+    </w:lvl>
+  </w:abstractNum>
+  <w:abstractNum w:abstractNumId="2" w15:restartNumberingAfterBreak="0">
     <w:nsid w:val="1C8D7466"/>
     <w:multiLevelType w:val="hybridMultilevel"/>
     <w:tmpl w:val="6CF45BE4"/>
@@ -2510,7 +3525,120 @@
       </w:pPr>
     </w:lvl>
   </w:abstractNum>
-  <w:abstractNum w:abstractNumId="1" w15:restartNumberingAfterBreak="0">
+  <w:abstractNum w:abstractNumId="3" w15:restartNumberingAfterBreak="0">
+    <w:nsid w:val="219E52A2"/>
+    <w:multiLevelType w:val="hybridMultilevel"/>
+    <w:tmpl w:val="39A83878"/>
+    <w:lvl w:ilvl="0" w:tplc="04160001">
+      <w:start w:val="1"/>
+      <w:numFmt w:val="bullet"/>
+      <w:lvlText w:val=""/>
+      <w:lvlJc w:val="left"/>
+      <w:pPr>
+        <w:ind w:left="1287" w:hanging="360"/>
+      </w:pPr>
+      <w:rPr>
+        <w:rFonts w:ascii="Symbol" w:hAnsi="Symbol" w:hint="default"/>
+      </w:rPr>
+    </w:lvl>
+    <w:lvl w:ilvl="1" w:tplc="04160003" w:tentative="1">
+      <w:start w:val="1"/>
+      <w:numFmt w:val="bullet"/>
+      <w:lvlText w:val="o"/>
+      <w:lvlJc w:val="left"/>
+      <w:pPr>
+        <w:ind w:left="2007" w:hanging="360"/>
+      </w:pPr>
+      <w:rPr>
+        <w:rFonts w:ascii="Courier New" w:hAnsi="Courier New" w:cs="Courier New" w:hint="default"/>
+      </w:rPr>
+    </w:lvl>
+    <w:lvl w:ilvl="2" w:tplc="04160005" w:tentative="1">
+      <w:start w:val="1"/>
+      <w:numFmt w:val="bullet"/>
+      <w:lvlText w:val=""/>
+      <w:lvlJc w:val="left"/>
+      <w:pPr>
+        <w:ind w:left="2727" w:hanging="360"/>
+      </w:pPr>
+      <w:rPr>
+        <w:rFonts w:ascii="Wingdings" w:hAnsi="Wingdings" w:hint="default"/>
+      </w:rPr>
+    </w:lvl>
+    <w:lvl w:ilvl="3" w:tplc="04160001" w:tentative="1">
+      <w:start w:val="1"/>
+      <w:numFmt w:val="bullet"/>
+      <w:lvlText w:val=""/>
+      <w:lvlJc w:val="left"/>
+      <w:pPr>
+        <w:ind w:left="3447" w:hanging="360"/>
+      </w:pPr>
+      <w:rPr>
+        <w:rFonts w:ascii="Symbol" w:hAnsi="Symbol" w:hint="default"/>
+      </w:rPr>
+    </w:lvl>
+    <w:lvl w:ilvl="4" w:tplc="04160003" w:tentative="1">
+      <w:start w:val="1"/>
+      <w:numFmt w:val="bullet"/>
+      <w:lvlText w:val="o"/>
+      <w:lvlJc w:val="left"/>
+      <w:pPr>
+        <w:ind w:left="4167" w:hanging="360"/>
+      </w:pPr>
+      <w:rPr>
+        <w:rFonts w:ascii="Courier New" w:hAnsi="Courier New" w:cs="Courier New" w:hint="default"/>
+      </w:rPr>
+    </w:lvl>
+    <w:lvl w:ilvl="5" w:tplc="04160005" w:tentative="1">
+      <w:start w:val="1"/>
+      <w:numFmt w:val="bullet"/>
+      <w:lvlText w:val=""/>
+      <w:lvlJc w:val="left"/>
+      <w:pPr>
+        <w:ind w:left="4887" w:hanging="360"/>
+      </w:pPr>
+      <w:rPr>
+        <w:rFonts w:ascii="Wingdings" w:hAnsi="Wingdings" w:hint="default"/>
+      </w:rPr>
+    </w:lvl>
+    <w:lvl w:ilvl="6" w:tplc="04160001" w:tentative="1">
+      <w:start w:val="1"/>
+      <w:numFmt w:val="bullet"/>
+      <w:lvlText w:val=""/>
+      <w:lvlJc w:val="left"/>
+      <w:pPr>
+        <w:ind w:left="5607" w:hanging="360"/>
+      </w:pPr>
+      <w:rPr>
+        <w:rFonts w:ascii="Symbol" w:hAnsi="Symbol" w:hint="default"/>
+      </w:rPr>
+    </w:lvl>
+    <w:lvl w:ilvl="7" w:tplc="04160003" w:tentative="1">
+      <w:start w:val="1"/>
+      <w:numFmt w:val="bullet"/>
+      <w:lvlText w:val="o"/>
+      <w:lvlJc w:val="left"/>
+      <w:pPr>
+        <w:ind w:left="6327" w:hanging="360"/>
+      </w:pPr>
+      <w:rPr>
+        <w:rFonts w:ascii="Courier New" w:hAnsi="Courier New" w:cs="Courier New" w:hint="default"/>
+      </w:rPr>
+    </w:lvl>
+    <w:lvl w:ilvl="8" w:tplc="04160005" w:tentative="1">
+      <w:start w:val="1"/>
+      <w:numFmt w:val="bullet"/>
+      <w:lvlText w:val=""/>
+      <w:lvlJc w:val="left"/>
+      <w:pPr>
+        <w:ind w:left="7047" w:hanging="360"/>
+      </w:pPr>
+      <w:rPr>
+        <w:rFonts w:ascii="Wingdings" w:hAnsi="Wingdings" w:hint="default"/>
+      </w:rPr>
+    </w:lvl>
+  </w:abstractNum>
+  <w:abstractNum w:abstractNumId="4" w15:restartNumberingAfterBreak="0">
     <w:nsid w:val="481B7478"/>
     <w:multiLevelType w:val="hybridMultilevel"/>
     <w:tmpl w:val="05060032"/>
@@ -2623,7 +3751,7 @@
       </w:rPr>
     </w:lvl>
   </w:abstractNum>
-  <w:abstractNum w:abstractNumId="2" w15:restartNumberingAfterBreak="0">
+  <w:abstractNum w:abstractNumId="5" w15:restartNumberingAfterBreak="0">
     <w:nsid w:val="60875BFB"/>
     <w:multiLevelType w:val="hybridMultilevel"/>
     <w:tmpl w:val="16A2C326"/>
@@ -2712,7 +3840,7 @@
       </w:pPr>
     </w:lvl>
   </w:abstractNum>
-  <w:abstractNum w:abstractNumId="3" w15:restartNumberingAfterBreak="0">
+  <w:abstractNum w:abstractNumId="6" w15:restartNumberingAfterBreak="0">
     <w:nsid w:val="68196124"/>
     <w:multiLevelType w:val="hybridMultilevel"/>
     <w:tmpl w:val="CCFA2514"/>
@@ -2825,15 +3953,24 @@
     </w:lvl>
   </w:abstractNum>
   <w:num w:numId="1">
+    <w:abstractNumId w:val="2"/>
+  </w:num>
+  <w:num w:numId="2">
+    <w:abstractNumId w:val="6"/>
+  </w:num>
+  <w:num w:numId="3">
+    <w:abstractNumId w:val="5"/>
+  </w:num>
+  <w:num w:numId="4">
+    <w:abstractNumId w:val="4"/>
+  </w:num>
+  <w:num w:numId="5">
+    <w:abstractNumId w:val="3"/>
+  </w:num>
+  <w:num w:numId="6">
     <w:abstractNumId w:val="0"/>
   </w:num>
-  <w:num w:numId="2">
-    <w:abstractNumId w:val="3"/>
-  </w:num>
-  <w:num w:numId="3">
-    <w:abstractNumId w:val="2"/>
-  </w:num>
-  <w:num w:numId="4">
+  <w:num w:numId="7">
     <w:abstractNumId w:val="1"/>
   </w:num>
 </w:numbering>

</xml_diff>